<commit_message>
Release the NHANES high-triglyceride report regenerated under the identity guard
The previous commit changed the code but left the old report in suppl/, the one with
the Friedewald identity still in the feature set (LogisticRegression, held-out AUROC
0.9972). This is the regenerated report: XGBoost, AUROC 0.8189, AUPRC 0.6553. It is
the version in Supplementary Data S6 and Table S11.1.

_ml_regen_summary.csv is the one-row-per-model summary of the 54 released prediction
reports. analysis/make_fig_s7.py and extract_and_compare.py read it, and it was not in
the repository before.
</commit_message>
<xml_diff>
--- a/suppl/NHANES/ml/Hypertriglyceridemia__prediction_NHANES.docx
+++ b/suppl/NHANES/ml/Hypertriglyceridemia__prediction_NHANES.docx
@@ -121,7 +121,7 @@
           </w:tcPr>
           <w:p>
             <w:r>
-              <w:t>59</w:t>
+              <w:t>55</w:t>
             </w:r>
           </w:p>
         </w:tc>
@@ -395,7 +395,7 @@
           </w:tcPr>
           <w:p>
             <w:r>
-              <w:t>0.9965</w:t>
+              <w:t>0.8324</w:t>
             </w:r>
           </w:p>
         </w:tc>
@@ -405,7 +405,7 @@
           </w:tcPr>
           <w:p>
             <w:r>
-              <w:t>0.9954</w:t>
+              <w:t>0.6599</w:t>
             </w:r>
           </w:p>
         </w:tc>
@@ -415,7 +415,7 @@
           </w:tcPr>
           <w:p>
             <w:r>
-              <w:t>0.9959</w:t>
+              <w:t>0.7461</w:t>
             </w:r>
           </w:p>
         </w:tc>
@@ -425,7 +425,7 @@
           </w:tcPr>
           <w:p>
             <w:r>
-              <w:t>{'penalty': 'l1', 'C': 1}</w:t>
+              <w:t>{'penalty': 'l2', 'C': 0.1}</w:t>
             </w:r>
           </w:p>
         </w:tc>
@@ -447,7 +447,7 @@
           </w:tcPr>
           <w:p>
             <w:r>
-              <w:t>0.9948</w:t>
+              <w:t>0.8315</w:t>
             </w:r>
           </w:p>
         </w:tc>
@@ -457,7 +457,7 @@
           </w:tcPr>
           <w:p>
             <w:r>
-              <w:t>0.985</w:t>
+              <w:t>0.6627</w:t>
             </w:r>
           </w:p>
         </w:tc>
@@ -467,7 +467,7 @@
           </w:tcPr>
           <w:p>
             <w:r>
-              <w:t>0.9899</w:t>
+              <w:t>0.7471</w:t>
             </w:r>
           </w:p>
         </w:tc>
@@ -477,7 +477,7 @@
           </w:tcPr>
           <w:p>
             <w:r>
-              <w:t>{'max_iter': 400, 'max_depth': None, 'learning_rate': 0.1}</w:t>
+              <w:t>{'max_iter': 400, 'max_depth': 3, 'learning_rate': 0.03}</w:t>
             </w:r>
           </w:p>
         </w:tc>
@@ -499,7 +499,7 @@
           </w:tcPr>
           <w:p>
             <w:r>
-              <w:t>0.9908</w:t>
+              <w:t>0.8326</w:t>
             </w:r>
           </w:p>
         </w:tc>
@@ -509,7 +509,7 @@
           </w:tcPr>
           <w:p>
             <w:r>
-              <w:t>0.9764</w:t>
+              <w:t>0.6656</w:t>
             </w:r>
           </w:p>
         </w:tc>
@@ -519,7 +519,7 @@
           </w:tcPr>
           <w:p>
             <w:r>
-              <w:t>0.9836</w:t>
+              <w:t>0.7491</w:t>
             </w:r>
           </w:p>
         </w:tc>
@@ -529,7 +529,7 @@
           </w:tcPr>
           <w:p>
             <w:r>
-              <w:t>{'subsample': 1.0, 'n_estimators': 300, 'max_depth': 3, 'learning_rate': 0.1}</w:t>
+              <w:t>{'subsample': 0.8, 'n_estimators': 500, 'max_depth': 3, 'learning_rate': 0.03}</w:t>
             </w:r>
           </w:p>
         </w:tc>
@@ -785,7 +785,7 @@
           </w:tcPr>
           <w:p>
             <w:r>
-              <w:t>LogisticRegression</w:t>
+              <w:t>XGBoost</w:t>
             </w:r>
           </w:p>
         </w:tc>
@@ -795,7 +795,7 @@
           </w:tcPr>
           <w:p>
             <w:r>
-              <w:t>0.9959</w:t>
+              <w:t>0.7491</w:t>
             </w:r>
           </w:p>
         </w:tc>
@@ -805,7 +805,7 @@
           </w:tcPr>
           <w:p>
             <w:r>
-              <w:t>434</w:t>
+              <w:t>201</w:t>
             </w:r>
           </w:p>
         </w:tc>
@@ -815,7 +815,7 @@
           </w:tcPr>
           <w:p>
             <w:r>
-              <w:t>1344</w:t>
+              <w:t>1257</w:t>
             </w:r>
           </w:p>
         </w:tc>
@@ -825,7 +825,7 @@
           </w:tcPr>
           <w:p>
             <w:r>
-              <w:t>7</w:t>
+              <w:t>94</w:t>
             </w:r>
           </w:p>
         </w:tc>
@@ -835,7 +835,7 @@
           </w:tcPr>
           <w:p>
             <w:r>
-              <w:t>15</w:t>
+              <w:t>248</w:t>
             </w:r>
           </w:p>
         </w:tc>
@@ -845,7 +845,7 @@
           </w:tcPr>
           <w:p>
             <w:r>
-              <w:t>0.9666</w:t>
+              <w:t>0.4477</w:t>
             </w:r>
           </w:p>
         </w:tc>
@@ -855,7 +855,7 @@
           </w:tcPr>
           <w:p>
             <w:r>
-              <w:t>0.9948</w:t>
+              <w:t>0.9304</w:t>
             </w:r>
           </w:p>
         </w:tc>
@@ -865,7 +865,7 @@
           </w:tcPr>
           <w:p>
             <w:r>
-              <w:t>0.9841</w:t>
+              <w:t>0.6814</w:t>
             </w:r>
           </w:p>
         </w:tc>
@@ -875,7 +875,7 @@
           </w:tcPr>
           <w:p>
             <w:r>
-              <w:t>0.989</w:t>
+              <w:t>0.8352</w:t>
             </w:r>
           </w:p>
         </w:tc>
@@ -885,7 +885,7 @@
           </w:tcPr>
           <w:p>
             <w:r>
-              <w:t>0.9878</w:t>
+              <w:t>0.81</w:t>
             </w:r>
           </w:p>
         </w:tc>
@@ -895,7 +895,7 @@
           </w:tcPr>
           <w:p>
             <w:r>
-              <w:t>0.9807</w:t>
+              <w:t>0.689</w:t>
             </w:r>
           </w:p>
         </w:tc>
@@ -905,7 +905,7 @@
           </w:tcPr>
           <w:p>
             <w:r>
-              <w:t>0.9753</w:t>
+              <w:t>0.5403</w:t>
             </w:r>
           </w:p>
         </w:tc>
@@ -915,7 +915,7 @@
           </w:tcPr>
           <w:p>
             <w:r>
-              <w:t>0.9672</w:t>
+              <w:t>0.4419</w:t>
             </w:r>
           </w:p>
         </w:tc>
@@ -925,7 +925,7 @@
           </w:tcPr>
           <w:p>
             <w:r>
-              <w:t>0.9672</w:t>
+              <w:t>0.427</w:t>
             </w:r>
           </w:p>
         </w:tc>
@@ -935,7 +935,7 @@
           </w:tcPr>
           <w:p>
             <w:r>
-              <w:t>0.9972</w:t>
+              <w:t>0.8189</w:t>
             </w:r>
           </w:p>
         </w:tc>
@@ -945,7 +945,7 @@
           </w:tcPr>
           <w:p>
             <w:r>
-              <w:t>0.9965</w:t>
+              <w:t>0.6553</w:t>
             </w:r>
           </w:p>
         </w:tc>
@@ -955,7 +955,7 @@
           </w:tcPr>
           <w:p>
             <w:r>
-              <w:t>0.0524</w:t>
+              <w:t>0.4236</w:t>
             </w:r>
           </w:p>
         </w:tc>
@@ -965,7 +965,7 @@
           </w:tcPr>
           <w:p>
             <w:r>
-              <w:t>0.0125</w:t>
+              <w:t>0.1348</w:t>
             </w:r>
           </w:p>
         </w:tc>
@@ -975,7 +975,7 @@
           </w:tcPr>
           <w:p>
             <w:r>
-              <w:t>0.9969</w:t>
+              <w:t>0.7371</w:t>
             </w:r>
           </w:p>
         </w:tc>
@@ -997,7 +997,7 @@
           </w:tcPr>
           <w:p>
             <w:r>
-              <w:t>0.9899</w:t>
+              <w:t>0.7471</w:t>
             </w:r>
           </w:p>
         </w:tc>
@@ -1007,7 +1007,7 @@
           </w:tcPr>
           <w:p>
             <w:r>
-              <w:t>420</w:t>
+              <w:t>187</w:t>
             </w:r>
           </w:p>
         </w:tc>
@@ -1017,7 +1017,7 @@
           </w:tcPr>
           <w:p>
             <w:r>
-              <w:t>1329</w:t>
+              <w:t>1270</w:t>
             </w:r>
           </w:p>
         </w:tc>
@@ -1027,7 +1027,7 @@
           </w:tcPr>
           <w:p>
             <w:r>
-              <w:t>22</w:t>
+              <w:t>81</w:t>
             </w:r>
           </w:p>
         </w:tc>
@@ -1037,7 +1037,7 @@
           </w:tcPr>
           <w:p>
             <w:r>
-              <w:t>29</w:t>
+              <w:t>262</w:t>
             </w:r>
           </w:p>
         </w:tc>
@@ -1047,7 +1047,7 @@
           </w:tcPr>
           <w:p>
             <w:r>
-              <w:t>0.9354</w:t>
+              <w:t>0.4165</w:t>
             </w:r>
           </w:p>
         </w:tc>
@@ -1057,7 +1057,7 @@
           </w:tcPr>
           <w:p>
             <w:r>
-              <w:t>0.9837</w:t>
+              <w:t>0.94</w:t>
             </w:r>
           </w:p>
         </w:tc>
@@ -1067,7 +1067,7 @@
           </w:tcPr>
           <w:p>
             <w:r>
-              <w:t>0.9502</w:t>
+              <w:t>0.6978</w:t>
             </w:r>
           </w:p>
         </w:tc>
@@ -1077,7 +1077,7 @@
           </w:tcPr>
           <w:p>
             <w:r>
-              <w:t>0.9786</w:t>
+              <w:t>0.829</w:t>
             </w:r>
           </w:p>
         </w:tc>
@@ -1087,7 +1087,7 @@
           </w:tcPr>
           <w:p>
             <w:r>
-              <w:t>0.9717</w:t>
+              <w:t>0.8094</w:t>
             </w:r>
           </w:p>
         </w:tc>
@@ -1097,7 +1097,7 @@
           </w:tcPr>
           <w:p>
             <w:r>
-              <w:t>0.9596</w:t>
+              <w:t>0.6783</w:t>
             </w:r>
           </w:p>
         </w:tc>
@@ -1107,7 +1107,7 @@
           </w:tcPr>
           <w:p>
             <w:r>
-              <w:t>0.9428</w:t>
+              <w:t>0.5216</w:t>
             </w:r>
           </w:p>
         </w:tc>
@@ -1117,7 +1117,7 @@
           </w:tcPr>
           <w:p>
             <w:r>
-              <w:t>0.924</w:t>
+              <w:t>0.4334</w:t>
             </w:r>
           </w:p>
         </w:tc>
@@ -1127,7 +1127,7 @@
           </w:tcPr>
           <w:p>
             <w:r>
-              <w:t>0.9239</w:t>
+              <w:t>0.412</w:t>
             </w:r>
           </w:p>
         </w:tc>
@@ -1137,7 +1137,7 @@
           </w:tcPr>
           <w:p>
             <w:r>
-              <w:t>0.9966</w:t>
+              <w:t>0.8184</w:t>
             </w:r>
           </w:p>
         </w:tc>
@@ -1147,7 +1147,7 @@
           </w:tcPr>
           <w:p>
             <w:r>
-              <w:t>0.9901</w:t>
+              <w:t>0.6535</w:t>
             </w:r>
           </w:p>
         </w:tc>
@@ -1157,7 +1157,7 @@
           </w:tcPr>
           <w:p>
             <w:r>
-              <w:t>0.0963</w:t>
+              <w:t>0.4222</w:t>
             </w:r>
           </w:p>
         </w:tc>
@@ -1167,7 +1167,7 @@
           </w:tcPr>
           <w:p>
             <w:r>
-              <w:t>0.0226</w:t>
+              <w:t>0.1349</w:t>
             </w:r>
           </w:p>
         </w:tc>
@@ -1177,7 +1177,7 @@
           </w:tcPr>
           <w:p>
             <w:r>
-              <w:t>0.9934</w:t>
+              <w:t>0.7359</w:t>
             </w:r>
           </w:p>
         </w:tc>
@@ -1189,7 +1189,7 @@
           </w:tcPr>
           <w:p>
             <w:r>
-              <w:t>XGBoost</w:t>
+              <w:t>LogisticRegression</w:t>
             </w:r>
           </w:p>
         </w:tc>
@@ -1199,7 +1199,7 @@
           </w:tcPr>
           <w:p>
             <w:r>
-              <w:t>0.9836</w:t>
+              <w:t>0.7461</w:t>
             </w:r>
           </w:p>
         </w:tc>
@@ -1209,7 +1209,7 @@
           </w:tcPr>
           <w:p>
             <w:r>
-              <w:t>394</w:t>
+              <w:t>201</w:t>
             </w:r>
           </w:p>
         </w:tc>
@@ -1219,7 +1219,7 @@
           </w:tcPr>
           <w:p>
             <w:r>
-              <w:t>1337</w:t>
+              <w:t>1267</w:t>
             </w:r>
           </w:p>
         </w:tc>
@@ -1229,7 +1229,7 @@
           </w:tcPr>
           <w:p>
             <w:r>
-              <w:t>14</w:t>
+              <w:t>84</w:t>
             </w:r>
           </w:p>
         </w:tc>
@@ -1239,7 +1239,7 @@
           </w:tcPr>
           <w:p>
             <w:r>
-              <w:t>55</w:t>
+              <w:t>248</w:t>
             </w:r>
           </w:p>
         </w:tc>
@@ -1249,7 +1249,7 @@
           </w:tcPr>
           <w:p>
             <w:r>
-              <w:t>0.8775</w:t>
+              <w:t>0.4477</w:t>
             </w:r>
           </w:p>
         </w:tc>
@@ -1259,7 +1259,7 @@
           </w:tcPr>
           <w:p>
             <w:r>
-              <w:t>0.9896</w:t>
+              <w:t>0.9378</w:t>
             </w:r>
           </w:p>
         </w:tc>
@@ -1269,7 +1269,7 @@
           </w:tcPr>
           <w:p>
             <w:r>
-              <w:t>0.9657</w:t>
+              <w:t>0.7053</w:t>
             </w:r>
           </w:p>
         </w:tc>
@@ -1279,7 +1279,7 @@
           </w:tcPr>
           <w:p>
             <w:r>
-              <w:t>0.9605</w:t>
+              <w:t>0.8363</w:t>
             </w:r>
           </w:p>
         </w:tc>
@@ -1289,7 +1289,7 @@
           </w:tcPr>
           <w:p>
             <w:r>
-              <w:t>0.9617</w:t>
+              <w:t>0.8156</w:t>
             </w:r>
           </w:p>
         </w:tc>
@@ -1299,7 +1299,7 @@
           </w:tcPr>
           <w:p>
             <w:r>
-              <w:t>0.9336</w:t>
+              <w:t>0.6927</w:t>
             </w:r>
           </w:p>
         </w:tc>
@@ -1309,7 +1309,7 @@
           </w:tcPr>
           <w:p>
             <w:r>
-              <w:t>0.9195</w:t>
+              <w:t>0.5477</w:t>
             </w:r>
           </w:p>
         </w:tc>
@@ -1319,7 +1319,7 @@
           </w:tcPr>
           <w:p>
             <w:r>
-              <w:t>0.8962</w:t>
+              <w:t>0.4569</w:t>
             </w:r>
           </w:p>
         </w:tc>
@@ -1329,7 +1329,7 @@
           </w:tcPr>
           <w:p>
             <w:r>
-              <w:t>0.8944</w:t>
+              <w:t>0.439</w:t>
             </w:r>
           </w:p>
         </w:tc>
@@ -1339,7 +1339,7 @@
           </w:tcPr>
           <w:p>
             <w:r>
-              <w:t>0.9932</w:t>
+              <w:t>0.8178</w:t>
             </w:r>
           </w:p>
         </w:tc>
@@ -1349,7 +1349,7 @@
           </w:tcPr>
           <w:p>
             <w:r>
-              <w:t>0.9813</w:t>
+              <w:t>0.644</w:t>
             </w:r>
           </w:p>
         </w:tc>
@@ -1359,7 +1359,7 @@
           </w:tcPr>
           <w:p>
             <w:r>
-              <w:t>0.108</w:t>
+              <w:t>0.4248</w:t>
             </w:r>
           </w:p>
         </w:tc>
@@ -1369,7 +1369,7 @@
           </w:tcPr>
           <w:p>
             <w:r>
-              <w:t>0.0299</w:t>
+              <w:t>0.1359</w:t>
             </w:r>
           </w:p>
         </w:tc>
@@ -1379,7 +1379,7 @@
           </w:tcPr>
           <w:p>
             <w:r>
-              <w:t>0.9873</w:t>
+              <w:t>0.7309</w:t>
             </w:r>
           </w:p>
         </w:tc>
@@ -1434,12 +1434,12 @@
         <w:pStyle w:val="Heading1"/>
       </w:pPr>
       <w:r>
-        <w:t>Selected final model — LogisticRegression (CV combined=0.9959; held-out auROC=0.9972)</w:t>
+        <w:t>Selected final model — XGBoost (CV combined=0.7491; held-out auROC=0.8189)</w:t>
       </w:r>
     </w:p>
     <w:p>
       <w:r>
-        <w:t>Among 3 candidate models, LogisticRegression achieved the highest cross-validated combined score (0.9959) within the training partition and was selected on that basis. Refitted on the complete training partition and evaluated once on the untouched held-out partition, it reached an area under the receiver operating characteristic curve of 0.9972 and an area under the precision-recall curve of 0.9965.</w:t>
+        <w:t>Among 3 candidate models, XGBoost achieved the highest cross-validated combined score (0.7491) within the training partition and was selected on that basis. Refitted on the complete training partition and evaluated once on the untouched held-out partition, it reached an area under the receiver operating characteristic curve of 0.8189 and an area under the precision-recall curve of 0.6553.</w:t>
       </w:r>
     </w:p>
     <w:p>
@@ -1598,7 +1598,7 @@
           </w:tcPr>
           <w:p>
             <w:r>
-              <w:t>448.0</w:t>
+              <w:t>404.0</w:t>
             </w:r>
           </w:p>
         </w:tc>
@@ -1608,7 +1608,7 @@
           </w:tcPr>
           <w:p>
             <w:r>
-              <w:t>1251.0</w:t>
+              <w:t>645.0</w:t>
             </w:r>
           </w:p>
         </w:tc>
@@ -1618,7 +1618,7 @@
           </w:tcPr>
           <w:p>
             <w:r>
-              <w:t>100.0</w:t>
+              <w:t>706.0</w:t>
             </w:r>
           </w:p>
         </w:tc>
@@ -1628,7 +1628,7 @@
           </w:tcPr>
           <w:p>
             <w:r>
-              <w:t>1.0</w:t>
+              <w:t>45.0</w:t>
             </w:r>
           </w:p>
         </w:tc>
@@ -1638,7 +1638,7 @@
           </w:tcPr>
           <w:p>
             <w:r>
-              <w:t>0.998</w:t>
+              <w:t>0.9</w:t>
             </w:r>
           </w:p>
         </w:tc>
@@ -1648,7 +1648,7 @@
           </w:tcPr>
           <w:p>
             <w:r>
-              <w:t>0.926</w:t>
+              <w:t>0.477</w:t>
             </w:r>
           </w:p>
         </w:tc>
@@ -1658,7 +1658,7 @@
           </w:tcPr>
           <w:p>
             <w:r>
-              <w:t>0.818</w:t>
+              <w:t>0.364</w:t>
             </w:r>
           </w:p>
         </w:tc>
@@ -1668,7 +1668,7 @@
           </w:tcPr>
           <w:p>
             <w:r>
-              <w:t>0.999</w:t>
+              <w:t>0.935</w:t>
             </w:r>
           </w:p>
         </w:tc>
@@ -1678,7 +1678,7 @@
           </w:tcPr>
           <w:p>
             <w:r>
-              <w:t>0.899</w:t>
+              <w:t>0.518</w:t>
             </w:r>
           </w:p>
         </w:tc>
@@ -1688,7 +1688,7 @@
           </w:tcPr>
           <w:p>
             <w:r>
-              <w:t>0.944</w:t>
+              <w:t>0.583</w:t>
             </w:r>
           </w:p>
         </w:tc>
@@ -1710,7 +1710,7 @@
           </w:tcPr>
           <w:p>
             <w:r>
-              <w:t>448.0</w:t>
+              <w:t>349.0</w:t>
             </w:r>
           </w:p>
         </w:tc>
@@ -1720,7 +1720,7 @@
           </w:tcPr>
           <w:p>
             <w:r>
-              <w:t>1284.0</w:t>
+              <w:t>929.0</w:t>
             </w:r>
           </w:p>
         </w:tc>
@@ -1730,7 +1730,7 @@
           </w:tcPr>
           <w:p>
             <w:r>
-              <w:t>67.0</w:t>
+              <w:t>422.0</w:t>
             </w:r>
           </w:p>
         </w:tc>
@@ -1740,7 +1740,7 @@
           </w:tcPr>
           <w:p>
             <w:r>
-              <w:t>1.0</w:t>
+              <w:t>100.0</w:t>
             </w:r>
           </w:p>
         </w:tc>
@@ -1750,7 +1750,7 @@
           </w:tcPr>
           <w:p>
             <w:r>
-              <w:t>0.998</w:t>
+              <w:t>0.777</w:t>
             </w:r>
           </w:p>
         </w:tc>
@@ -1760,7 +1760,7 @@
           </w:tcPr>
           <w:p>
             <w:r>
-              <w:t>0.95</w:t>
+              <w:t>0.688</w:t>
             </w:r>
           </w:p>
         </w:tc>
@@ -1770,7 +1770,7 @@
           </w:tcPr>
           <w:p>
             <w:r>
-              <w:t>0.87</w:t>
+              <w:t>0.453</w:t>
             </w:r>
           </w:p>
         </w:tc>
@@ -1780,7 +1780,7 @@
           </w:tcPr>
           <w:p>
             <w:r>
-              <w:t>0.999</w:t>
+              <w:t>0.903</w:t>
             </w:r>
           </w:p>
         </w:tc>
@@ -1790,7 +1790,7 @@
           </w:tcPr>
           <w:p>
             <w:r>
-              <w:t>0.929</w:t>
+              <w:t>0.572</w:t>
             </w:r>
           </w:p>
         </w:tc>
@@ -1800,7 +1800,7 @@
           </w:tcPr>
           <w:p>
             <w:r>
-              <w:t>0.962</w:t>
+              <w:t>0.71</w:t>
             </w:r>
           </w:p>
         </w:tc>
@@ -1822,7 +1822,7 @@
           </w:tcPr>
           <w:p>
             <w:r>
-              <w:t>448.0</w:t>
+              <w:t>300.0</w:t>
             </w:r>
           </w:p>
         </w:tc>
@@ -1832,7 +1832,7 @@
           </w:tcPr>
           <w:p>
             <w:r>
-              <w:t>1309.0</w:t>
+              <w:t>1089.0</w:t>
             </w:r>
           </w:p>
         </w:tc>
@@ -1842,7 +1842,7 @@
           </w:tcPr>
           <w:p>
             <w:r>
-              <w:t>42.0</w:t>
+              <w:t>262.0</w:t>
             </w:r>
           </w:p>
         </w:tc>
@@ -1852,7 +1852,7 @@
           </w:tcPr>
           <w:p>
             <w:r>
-              <w:t>1.0</w:t>
+              <w:t>149.0</w:t>
             </w:r>
           </w:p>
         </w:tc>
@@ -1862,7 +1862,7 @@
           </w:tcPr>
           <w:p>
             <w:r>
-              <w:t>0.998</w:t>
+              <w:t>0.668</w:t>
             </w:r>
           </w:p>
         </w:tc>
@@ -1872,7 +1872,7 @@
           </w:tcPr>
           <w:p>
             <w:r>
-              <w:t>0.969</w:t>
+              <w:t>0.806</w:t>
             </w:r>
           </w:p>
         </w:tc>
@@ -1882,7 +1882,7 @@
           </w:tcPr>
           <w:p>
             <w:r>
-              <w:t>0.914</w:t>
+              <w:t>0.534</w:t>
             </w:r>
           </w:p>
         </w:tc>
@@ -1892,7 +1892,7 @@
           </w:tcPr>
           <w:p>
             <w:r>
-              <w:t>0.999</w:t>
+              <w:t>0.88</w:t>
             </w:r>
           </w:p>
         </w:tc>
@@ -1902,7 +1902,7 @@
           </w:tcPr>
           <w:p>
             <w:r>
-              <w:t>0.954</w:t>
+              <w:t>0.593</w:t>
             </w:r>
           </w:p>
         </w:tc>
@@ -1912,7 +1912,7 @@
           </w:tcPr>
           <w:p>
             <w:r>
-              <w:t>0.976</w:t>
+              <w:t>0.772</w:t>
             </w:r>
           </w:p>
         </w:tc>
@@ -1934,7 +1934,7 @@
           </w:tcPr>
           <w:p>
             <w:r>
-              <w:t>442.0</w:t>
+              <w:t>247.0</w:t>
             </w:r>
           </w:p>
         </w:tc>
@@ -1944,7 +1944,7 @@
           </w:tcPr>
           <w:p>
             <w:r>
-              <w:t>1332.0</w:t>
+              <w:t>1187.0</w:t>
             </w:r>
           </w:p>
         </w:tc>
@@ -1954,7 +1954,7 @@
           </w:tcPr>
           <w:p>
             <w:r>
-              <w:t>19.0</w:t>
+              <w:t>164.0</w:t>
             </w:r>
           </w:p>
         </w:tc>
@@ -1964,7 +1964,7 @@
           </w:tcPr>
           <w:p>
             <w:r>
-              <w:t>7.0</w:t>
+              <w:t>202.0</w:t>
             </w:r>
           </w:p>
         </w:tc>
@@ -1974,7 +1974,7 @@
           </w:tcPr>
           <w:p>
             <w:r>
-              <w:t>0.984</w:t>
+              <w:t>0.55</w:t>
             </w:r>
           </w:p>
         </w:tc>
@@ -1984,7 +1984,7 @@
           </w:tcPr>
           <w:p>
             <w:r>
-              <w:t>0.986</w:t>
+              <w:t>0.879</w:t>
             </w:r>
           </w:p>
         </w:tc>
@@ -1994,7 +1994,7 @@
           </w:tcPr>
           <w:p>
             <w:r>
-              <w:t>0.959</w:t>
+              <w:t>0.601</w:t>
             </w:r>
           </w:p>
         </w:tc>
@@ -2004,7 +2004,7 @@
           </w:tcPr>
           <w:p>
             <w:r>
-              <w:t>0.995</w:t>
+              <w:t>0.855</w:t>
             </w:r>
           </w:p>
         </w:tc>
@@ -2014,7 +2014,7 @@
           </w:tcPr>
           <w:p>
             <w:r>
-              <w:t>0.971</w:t>
+              <w:t>0.574</w:t>
             </w:r>
           </w:p>
         </w:tc>
@@ -2024,7 +2024,7 @@
           </w:tcPr>
           <w:p>
             <w:r>
-              <w:t>0.986</w:t>
+              <w:t>0.797</w:t>
             </w:r>
           </w:p>
         </w:tc>
@@ -2046,7 +2046,343 @@
           </w:tcPr>
           <w:p>
             <w:r>
-              <w:t>434.0</w:t>
+              <w:t>201.0</w:t>
+            </w:r>
+          </w:p>
+        </w:tc>
+        <w:tc>
+          <w:tcPr>
+            <w:tcW w:type="dxa" w:w="785"/>
+          </w:tcPr>
+          <w:p>
+            <w:r>
+              <w:t>1257.0</w:t>
+            </w:r>
+          </w:p>
+        </w:tc>
+        <w:tc>
+          <w:tcPr>
+            <w:tcW w:type="dxa" w:w="785"/>
+          </w:tcPr>
+          <w:p>
+            <w:r>
+              <w:t>94.0</w:t>
+            </w:r>
+          </w:p>
+        </w:tc>
+        <w:tc>
+          <w:tcPr>
+            <w:tcW w:type="dxa" w:w="785"/>
+          </w:tcPr>
+          <w:p>
+            <w:r>
+              <w:t>248.0</w:t>
+            </w:r>
+          </w:p>
+        </w:tc>
+        <w:tc>
+          <w:tcPr>
+            <w:tcW w:type="dxa" w:w="785"/>
+          </w:tcPr>
+          <w:p>
+            <w:r>
+              <w:t>0.448</w:t>
+            </w:r>
+          </w:p>
+        </w:tc>
+        <w:tc>
+          <w:tcPr>
+            <w:tcW w:type="dxa" w:w="785"/>
+          </w:tcPr>
+          <w:p>
+            <w:r>
+              <w:t>0.93</w:t>
+            </w:r>
+          </w:p>
+        </w:tc>
+        <w:tc>
+          <w:tcPr>
+            <w:tcW w:type="dxa" w:w="785"/>
+          </w:tcPr>
+          <w:p>
+            <w:r>
+              <w:t>0.681</w:t>
+            </w:r>
+          </w:p>
+        </w:tc>
+        <w:tc>
+          <w:tcPr>
+            <w:tcW w:type="dxa" w:w="785"/>
+          </w:tcPr>
+          <w:p>
+            <w:r>
+              <w:t>0.835</w:t>
+            </w:r>
+          </w:p>
+        </w:tc>
+        <w:tc>
+          <w:tcPr>
+            <w:tcW w:type="dxa" w:w="785"/>
+          </w:tcPr>
+          <w:p>
+            <w:r>
+              <w:t>0.54</w:t>
+            </w:r>
+          </w:p>
+        </w:tc>
+        <w:tc>
+          <w:tcPr>
+            <w:tcW w:type="dxa" w:w="785"/>
+          </w:tcPr>
+          <w:p>
+            <w:r>
+              <w:t>0.81</w:t>
+            </w:r>
+          </w:p>
+        </w:tc>
+      </w:tr>
+      <w:tr>
+        <w:tc>
+          <w:tcPr>
+            <w:tcW w:type="dxa" w:w="785"/>
+          </w:tcPr>
+          <w:p>
+            <w:r>
+              <w:t>0.6</w:t>
+            </w:r>
+          </w:p>
+        </w:tc>
+        <w:tc>
+          <w:tcPr>
+            <w:tcW w:type="dxa" w:w="785"/>
+          </w:tcPr>
+          <w:p>
+            <w:r>
+              <w:t>151.0</w:t>
+            </w:r>
+          </w:p>
+        </w:tc>
+        <w:tc>
+          <w:tcPr>
+            <w:tcW w:type="dxa" w:w="785"/>
+          </w:tcPr>
+          <w:p>
+            <w:r>
+              <w:t>1307.0</w:t>
+            </w:r>
+          </w:p>
+        </w:tc>
+        <w:tc>
+          <w:tcPr>
+            <w:tcW w:type="dxa" w:w="785"/>
+          </w:tcPr>
+          <w:p>
+            <w:r>
+              <w:t>44.0</w:t>
+            </w:r>
+          </w:p>
+        </w:tc>
+        <w:tc>
+          <w:tcPr>
+            <w:tcW w:type="dxa" w:w="785"/>
+          </w:tcPr>
+          <w:p>
+            <w:r>
+              <w:t>298.0</w:t>
+            </w:r>
+          </w:p>
+        </w:tc>
+        <w:tc>
+          <w:tcPr>
+            <w:tcW w:type="dxa" w:w="785"/>
+          </w:tcPr>
+          <w:p>
+            <w:r>
+              <w:t>0.336</w:t>
+            </w:r>
+          </w:p>
+        </w:tc>
+        <w:tc>
+          <w:tcPr>
+            <w:tcW w:type="dxa" w:w="785"/>
+          </w:tcPr>
+          <w:p>
+            <w:r>
+              <w:t>0.967</w:t>
+            </w:r>
+          </w:p>
+        </w:tc>
+        <w:tc>
+          <w:tcPr>
+            <w:tcW w:type="dxa" w:w="785"/>
+          </w:tcPr>
+          <w:p>
+            <w:r>
+              <w:t>0.774</w:t>
+            </w:r>
+          </w:p>
+        </w:tc>
+        <w:tc>
+          <w:tcPr>
+            <w:tcW w:type="dxa" w:w="785"/>
+          </w:tcPr>
+          <w:p>
+            <w:r>
+              <w:t>0.814</w:t>
+            </w:r>
+          </w:p>
+        </w:tc>
+        <w:tc>
+          <w:tcPr>
+            <w:tcW w:type="dxa" w:w="785"/>
+          </w:tcPr>
+          <w:p>
+            <w:r>
+              <w:t>0.469</w:t>
+            </w:r>
+          </w:p>
+        </w:tc>
+        <w:tc>
+          <w:tcPr>
+            <w:tcW w:type="dxa" w:w="785"/>
+          </w:tcPr>
+          <w:p>
+            <w:r>
+              <w:t>0.81</w:t>
+            </w:r>
+          </w:p>
+        </w:tc>
+      </w:tr>
+      <w:tr>
+        <w:tc>
+          <w:tcPr>
+            <w:tcW w:type="dxa" w:w="785"/>
+          </w:tcPr>
+          <w:p>
+            <w:r>
+              <w:t>0.7</w:t>
+            </w:r>
+          </w:p>
+        </w:tc>
+        <w:tc>
+          <w:tcPr>
+            <w:tcW w:type="dxa" w:w="785"/>
+          </w:tcPr>
+          <w:p>
+            <w:r>
+              <w:t>109.0</w:t>
+            </w:r>
+          </w:p>
+        </w:tc>
+        <w:tc>
+          <w:tcPr>
+            <w:tcW w:type="dxa" w:w="785"/>
+          </w:tcPr>
+          <w:p>
+            <w:r>
+              <w:t>1330.0</w:t>
+            </w:r>
+          </w:p>
+        </w:tc>
+        <w:tc>
+          <w:tcPr>
+            <w:tcW w:type="dxa" w:w="785"/>
+          </w:tcPr>
+          <w:p>
+            <w:r>
+              <w:t>21.0</w:t>
+            </w:r>
+          </w:p>
+        </w:tc>
+        <w:tc>
+          <w:tcPr>
+            <w:tcW w:type="dxa" w:w="785"/>
+          </w:tcPr>
+          <w:p>
+            <w:r>
+              <w:t>340.0</w:t>
+            </w:r>
+          </w:p>
+        </w:tc>
+        <w:tc>
+          <w:tcPr>
+            <w:tcW w:type="dxa" w:w="785"/>
+          </w:tcPr>
+          <w:p>
+            <w:r>
+              <w:t>0.243</w:t>
+            </w:r>
+          </w:p>
+        </w:tc>
+        <w:tc>
+          <w:tcPr>
+            <w:tcW w:type="dxa" w:w="785"/>
+          </w:tcPr>
+          <w:p>
+            <w:r>
+              <w:t>0.984</w:t>
+            </w:r>
+          </w:p>
+        </w:tc>
+        <w:tc>
+          <w:tcPr>
+            <w:tcW w:type="dxa" w:w="785"/>
+          </w:tcPr>
+          <w:p>
+            <w:r>
+              <w:t>0.838</w:t>
+            </w:r>
+          </w:p>
+        </w:tc>
+        <w:tc>
+          <w:tcPr>
+            <w:tcW w:type="dxa" w:w="785"/>
+          </w:tcPr>
+          <w:p>
+            <w:r>
+              <w:t>0.796</w:t>
+            </w:r>
+          </w:p>
+        </w:tc>
+        <w:tc>
+          <w:tcPr>
+            <w:tcW w:type="dxa" w:w="785"/>
+          </w:tcPr>
+          <w:p>
+            <w:r>
+              <w:t>0.377</w:t>
+            </w:r>
+          </w:p>
+        </w:tc>
+        <w:tc>
+          <w:tcPr>
+            <w:tcW w:type="dxa" w:w="785"/>
+          </w:tcPr>
+          <w:p>
+            <w:r>
+              <w:t>0.799</w:t>
+            </w:r>
+          </w:p>
+        </w:tc>
+      </w:tr>
+      <w:tr>
+        <w:tc>
+          <w:tcPr>
+            <w:tcW w:type="dxa" w:w="785"/>
+          </w:tcPr>
+          <w:p>
+            <w:r>
+              <w:t>0.8</w:t>
+            </w:r>
+          </w:p>
+        </w:tc>
+        <w:tc>
+          <w:tcPr>
+            <w:tcW w:type="dxa" w:w="785"/>
+          </w:tcPr>
+          <w:p>
+            <w:r>
+              <w:t>68.0</w:t>
             </w:r>
           </w:p>
         </w:tc>
@@ -2076,7 +2412,7 @@
           </w:tcPr>
           <w:p>
             <w:r>
-              <w:t>15.0</w:t>
+              <w:t>381.0</w:t>
             </w:r>
           </w:p>
         </w:tc>
@@ -2086,7 +2422,7 @@
           </w:tcPr>
           <w:p>
             <w:r>
-              <w:t>0.967</w:t>
+              <w:t>0.151</w:t>
             </w:r>
           </w:p>
         </w:tc>
@@ -2106,7 +2442,7 @@
           </w:tcPr>
           <w:p>
             <w:r>
-              <w:t>0.984</w:t>
+              <w:t>0.907</w:t>
             </w:r>
           </w:p>
         </w:tc>
@@ -2116,7 +2452,7 @@
           </w:tcPr>
           <w:p>
             <w:r>
-              <w:t>0.989</w:t>
+              <w:t>0.779</w:t>
             </w:r>
           </w:p>
         </w:tc>
@@ -2126,7 +2462,7 @@
           </w:tcPr>
           <w:p>
             <w:r>
-              <w:t>0.975</w:t>
+              <w:t>0.26</w:t>
             </w:r>
           </w:p>
         </w:tc>
@@ -2136,7 +2472,7 @@
           </w:tcPr>
           <w:p>
             <w:r>
-              <w:t>0.988</w:t>
+              <w:t>0.784</w:t>
             </w:r>
           </w:p>
         </w:tc>
@@ -2148,7 +2484,7 @@
           </w:tcPr>
           <w:p>
             <w:r>
-              <w:t>0.6</w:t>
+              <w:t>0.9</w:t>
             </w:r>
           </w:p>
         </w:tc>
@@ -2158,7 +2494,7 @@
           </w:tcPr>
           <w:p>
             <w:r>
-              <w:t>420.0</w:t>
+              <w:t>35.0</w:t>
             </w:r>
           </w:p>
         </w:tc>
@@ -2188,7 +2524,7 @@
           </w:tcPr>
           <w:p>
             <w:r>
-              <w:t>29.0</w:t>
+              <w:t>414.0</w:t>
             </w:r>
           </w:p>
         </w:tc>
@@ -2198,7 +2534,7 @@
           </w:tcPr>
           <w:p>
             <w:r>
-              <w:t>0.935</w:t>
+              <w:t>0.078</w:t>
             </w:r>
           </w:p>
         </w:tc>
@@ -2218,7 +2554,7 @@
           </w:tcPr>
           <w:p>
             <w:r>
-              <w:t>0.998</w:t>
+              <w:t>0.972</w:t>
             </w:r>
           </w:p>
         </w:tc>
@@ -2228,7 +2564,7 @@
           </w:tcPr>
           <w:p>
             <w:r>
-              <w:t>0.979</w:t>
+              <w:t>0.765</w:t>
             </w:r>
           </w:p>
         </w:tc>
@@ -2238,7 +2574,7 @@
           </w:tcPr>
           <w:p>
             <w:r>
-              <w:t>0.966</w:t>
+              <w:t>0.144</w:t>
             </w:r>
           </w:p>
         </w:tc>
@@ -2248,343 +2584,7 @@
           </w:tcPr>
           <w:p>
             <w:r>
-              <w:t>0.983</w:t>
-            </w:r>
-          </w:p>
-        </w:tc>
-      </w:tr>
-      <w:tr>
-        <w:tc>
-          <w:tcPr>
-            <w:tcW w:type="dxa" w:w="785"/>
-          </w:tcPr>
-          <w:p>
-            <w:r>
-              <w:t>0.7</w:t>
-            </w:r>
-          </w:p>
-        </w:tc>
-        <w:tc>
-          <w:tcPr>
-            <w:tcW w:type="dxa" w:w="785"/>
-          </w:tcPr>
-          <w:p>
-            <w:r>
-              <w:t>407.0</w:t>
-            </w:r>
-          </w:p>
-        </w:tc>
-        <w:tc>
-          <w:tcPr>
-            <w:tcW w:type="dxa" w:w="785"/>
-          </w:tcPr>
-          <w:p>
-            <w:r>
-              <w:t>1351.0</w:t>
-            </w:r>
-          </w:p>
-        </w:tc>
-        <w:tc>
-          <w:tcPr>
-            <w:tcW w:type="dxa" w:w="785"/>
-          </w:tcPr>
-          <w:p>
-            <w:r>
-              <w:t>0.0</w:t>
-            </w:r>
-          </w:p>
-        </w:tc>
-        <w:tc>
-          <w:tcPr>
-            <w:tcW w:type="dxa" w:w="785"/>
-          </w:tcPr>
-          <w:p>
-            <w:r>
-              <w:t>42.0</w:t>
-            </w:r>
-          </w:p>
-        </w:tc>
-        <w:tc>
-          <w:tcPr>
-            <w:tcW w:type="dxa" w:w="785"/>
-          </w:tcPr>
-          <w:p>
-            <w:r>
-              <w:t>0.906</w:t>
-            </w:r>
-          </w:p>
-        </w:tc>
-        <w:tc>
-          <w:tcPr>
-            <w:tcW w:type="dxa" w:w="785"/>
-          </w:tcPr>
-          <w:p>
-            <w:r>
-              <w:t>1.0</w:t>
-            </w:r>
-          </w:p>
-        </w:tc>
-        <w:tc>
-          <w:tcPr>
-            <w:tcW w:type="dxa" w:w="785"/>
-          </w:tcPr>
-          <w:p>
-            <w:r>
-              <w:t>1.0</w:t>
-            </w:r>
-          </w:p>
-        </w:tc>
-        <w:tc>
-          <w:tcPr>
-            <w:tcW w:type="dxa" w:w="785"/>
-          </w:tcPr>
-          <w:p>
-            <w:r>
-              <w:t>0.97</w:t>
-            </w:r>
-          </w:p>
-        </w:tc>
-        <w:tc>
-          <w:tcPr>
-            <w:tcW w:type="dxa" w:w="785"/>
-          </w:tcPr>
-          <w:p>
-            <w:r>
-              <w:t>0.951</w:t>
-            </w:r>
-          </w:p>
-        </w:tc>
-        <w:tc>
-          <w:tcPr>
-            <w:tcW w:type="dxa" w:w="785"/>
-          </w:tcPr>
-          <w:p>
-            <w:r>
-              <w:t>0.977</w:t>
-            </w:r>
-          </w:p>
-        </w:tc>
-      </w:tr>
-      <w:tr>
-        <w:tc>
-          <w:tcPr>
-            <w:tcW w:type="dxa" w:w="785"/>
-          </w:tcPr>
-          <w:p>
-            <w:r>
-              <w:t>0.8</w:t>
-            </w:r>
-          </w:p>
-        </w:tc>
-        <w:tc>
-          <w:tcPr>
-            <w:tcW w:type="dxa" w:w="785"/>
-          </w:tcPr>
-          <w:p>
-            <w:r>
-              <w:t>389.0</w:t>
-            </w:r>
-          </w:p>
-        </w:tc>
-        <w:tc>
-          <w:tcPr>
-            <w:tcW w:type="dxa" w:w="785"/>
-          </w:tcPr>
-          <w:p>
-            <w:r>
-              <w:t>1351.0</w:t>
-            </w:r>
-          </w:p>
-        </w:tc>
-        <w:tc>
-          <w:tcPr>
-            <w:tcW w:type="dxa" w:w="785"/>
-          </w:tcPr>
-          <w:p>
-            <w:r>
-              <w:t>0.0</w:t>
-            </w:r>
-          </w:p>
-        </w:tc>
-        <w:tc>
-          <w:tcPr>
-            <w:tcW w:type="dxa" w:w="785"/>
-          </w:tcPr>
-          <w:p>
-            <w:r>
-              <w:t>60.0</w:t>
-            </w:r>
-          </w:p>
-        </w:tc>
-        <w:tc>
-          <w:tcPr>
-            <w:tcW w:type="dxa" w:w="785"/>
-          </w:tcPr>
-          <w:p>
-            <w:r>
-              <w:t>0.866</w:t>
-            </w:r>
-          </w:p>
-        </w:tc>
-        <w:tc>
-          <w:tcPr>
-            <w:tcW w:type="dxa" w:w="785"/>
-          </w:tcPr>
-          <w:p>
-            <w:r>
-              <w:t>1.0</w:t>
-            </w:r>
-          </w:p>
-        </w:tc>
-        <w:tc>
-          <w:tcPr>
-            <w:tcW w:type="dxa" w:w="785"/>
-          </w:tcPr>
-          <w:p>
-            <w:r>
-              <w:t>1.0</w:t>
-            </w:r>
-          </w:p>
-        </w:tc>
-        <w:tc>
-          <w:tcPr>
-            <w:tcW w:type="dxa" w:w="785"/>
-          </w:tcPr>
-          <w:p>
-            <w:r>
-              <w:t>0.957</w:t>
-            </w:r>
-          </w:p>
-        </w:tc>
-        <w:tc>
-          <w:tcPr>
-            <w:tcW w:type="dxa" w:w="785"/>
-          </w:tcPr>
-          <w:p>
-            <w:r>
-              <w:t>0.928</w:t>
-            </w:r>
-          </w:p>
-        </w:tc>
-        <w:tc>
-          <w:tcPr>
-            <w:tcW w:type="dxa" w:w="785"/>
-          </w:tcPr>
-          <w:p>
-            <w:r>
-              <w:t>0.967</w:t>
-            </w:r>
-          </w:p>
-        </w:tc>
-      </w:tr>
-      <w:tr>
-        <w:tc>
-          <w:tcPr>
-            <w:tcW w:type="dxa" w:w="785"/>
-          </w:tcPr>
-          <w:p>
-            <w:r>
-              <w:t>0.9</w:t>
-            </w:r>
-          </w:p>
-        </w:tc>
-        <w:tc>
-          <w:tcPr>
-            <w:tcW w:type="dxa" w:w="785"/>
-          </w:tcPr>
-          <w:p>
-            <w:r>
-              <w:t>362.0</w:t>
-            </w:r>
-          </w:p>
-        </w:tc>
-        <w:tc>
-          <w:tcPr>
-            <w:tcW w:type="dxa" w:w="785"/>
-          </w:tcPr>
-          <w:p>
-            <w:r>
-              <w:t>1351.0</w:t>
-            </w:r>
-          </w:p>
-        </w:tc>
-        <w:tc>
-          <w:tcPr>
-            <w:tcW w:type="dxa" w:w="785"/>
-          </w:tcPr>
-          <w:p>
-            <w:r>
-              <w:t>0.0</w:t>
-            </w:r>
-          </w:p>
-        </w:tc>
-        <w:tc>
-          <w:tcPr>
-            <w:tcW w:type="dxa" w:w="785"/>
-          </w:tcPr>
-          <w:p>
-            <w:r>
-              <w:t>87.0</w:t>
-            </w:r>
-          </w:p>
-        </w:tc>
-        <w:tc>
-          <w:tcPr>
-            <w:tcW w:type="dxa" w:w="785"/>
-          </w:tcPr>
-          <w:p>
-            <w:r>
-              <w:t>0.806</w:t>
-            </w:r>
-          </w:p>
-        </w:tc>
-        <w:tc>
-          <w:tcPr>
-            <w:tcW w:type="dxa" w:w="785"/>
-          </w:tcPr>
-          <w:p>
-            <w:r>
-              <w:t>1.0</w:t>
-            </w:r>
-          </w:p>
-        </w:tc>
-        <w:tc>
-          <w:tcPr>
-            <w:tcW w:type="dxa" w:w="785"/>
-          </w:tcPr>
-          <w:p>
-            <w:r>
-              <w:t>1.0</w:t>
-            </w:r>
-          </w:p>
-        </w:tc>
-        <w:tc>
-          <w:tcPr>
-            <w:tcW w:type="dxa" w:w="785"/>
-          </w:tcPr>
-          <w:p>
-            <w:r>
-              <w:t>0.939</w:t>
-            </w:r>
-          </w:p>
-        </w:tc>
-        <w:tc>
-          <w:tcPr>
-            <w:tcW w:type="dxa" w:w="785"/>
-          </w:tcPr>
-          <w:p>
-            <w:r>
-              <w:t>0.893</w:t>
-            </w:r>
-          </w:p>
-        </w:tc>
-        <w:tc>
-          <w:tcPr>
-            <w:tcW w:type="dxa" w:w="785"/>
-          </w:tcPr>
-          <w:p>
-            <w:r>
-              <w:t>0.952</w:t>
+              <w:t>0.769</w:t>
             </w:r>
           </w:p>
         </w:tc>
@@ -2646,7 +2646,7 @@
       <w:r>
         <w:drawing>
           <wp:inline xmlns:a="http://schemas.openxmlformats.org/drawingml/2006/main" xmlns:pic="http://schemas.openxmlformats.org/drawingml/2006/picture">
-            <wp:extent cx="5486400" cy="3557847"/>
+            <wp:extent cx="5486400" cy="3595987"/>
             <wp:docPr id="3" name="Picture 3"/>
             <wp:cNvGraphicFramePr>
               <a:graphicFrameLocks noChangeAspect="1"/>
@@ -2667,7 +2667,7 @@
                   <pic:spPr>
                     <a:xfrm>
                       <a:off x="0" y="0"/>
-                      <a:ext cx="5486400" cy="3557847"/>
+                      <a:ext cx="5486400" cy="3595987"/>
                     </a:xfrm>
                     <a:prstGeom prst="rect"/>
                   </pic:spPr>
@@ -2690,7 +2690,7 @@
       <w:r>
         <w:drawing>
           <wp:inline xmlns:a="http://schemas.openxmlformats.org/drawingml/2006/main" xmlns:pic="http://schemas.openxmlformats.org/drawingml/2006/picture">
-            <wp:extent cx="6400800" cy="2750574"/>
+            <wp:extent cx="6400800" cy="2747409"/>
             <wp:docPr id="4" name="Picture 4"/>
             <wp:cNvGraphicFramePr>
               <a:graphicFrameLocks noChangeAspect="1"/>
@@ -2711,7 +2711,7 @@
                   <pic:spPr>
                     <a:xfrm>
                       <a:off x="0" y="0"/>
-                      <a:ext cx="6400800" cy="2750574"/>
+                      <a:ext cx="6400800" cy="2747409"/>
                     </a:xfrm>
                     <a:prstGeom prst="rect"/>
                   </pic:spPr>

</xml_diff>